<commit_message>
Ahora da aviso de hacer pedido por si el cliente se olvido de hacer un pedido en el primer avis de las 9 ahora da aviso a las 15
</commit_message>
<xml_diff>
--- a/Para el cliente/TuStockApp_Un_Vendedor_en_el_Bolsillo.docx
+++ b/Para el cliente/TuStockApp_Un_Vendedor_en_el_Bolsillo.docx
@@ -483,7 +483,7 @@
                 <w:sz w:val="21"/>
                 <w:szCs w:val="21"/>
               </w:rPr>
-              <w:t xml:space="preserve">Así lo hace la app: </w:t>
+              <w:t>Así lo hace la app: Recordatorios automáticos — un aviso al celular a las 9:00 si el cliente todavía no hizo su pedido en el día, con un segundo aviso a las 15:30 si sigue sin pedir, más una sugerencia puntual cuando el sistema aprende (cliente por cliente y producto por producto) cada cuántos días suele repetir cada compra, y avisa un par de días antes de que se cumpla ese ciclo.</w:t>
             </w:r>
             <w:r>
               <w:rPr>
@@ -493,7 +493,6 @@
                 <w:sz w:val="21"/>
                 <w:szCs w:val="21"/>
               </w:rPr>
-              <w:t xml:space="preserve">Recordatorios automáticos</w:t>
             </w:r>
             <w:r>
               <w:rPr>
@@ -501,7 +500,6 @@
                 <w:sz w:val="21"/>
                 <w:szCs w:val="21"/>
               </w:rPr>
-              <w:t xml:space="preserve"> — un aviso diario al celular si el cliente todavía no hizo su pedido en el día, más una sugerencia puntual cuando el sistema aprende (cliente por cliente y producto por producto) cada cuántos días suele repetir cada compra, y avisa un par de días antes de que se cumpla ese ciclo.</w:t>
             </w:r>
           </w:p>
         </w:tc>

</xml_diff>